<commit_message>
Range of random numbers is dependent on the size of the array. One third of the time they are all negative, one third of the time all positive, one third of the time both positive and negative.
</commit_message>
<xml_diff>
--- a/Lab 6 - Arrays I.docx
+++ b/Lab 6 - Arrays I.docx
@@ -266,7 +266,42 @@
           <w:rFonts w:ascii="TimesNewRomanPSMT" w:hAnsi="TimesNewRomanPSMT"/>
           <w:szCs w:val="32"/>
         </w:rPr>
-        <w:t>, and initializes each cell in the array to a random value between -1000 and 1000, inclusive.</w:t>
+        <w:t xml:space="preserve">, and initializes each cell in the array to a </w:t>
+      </w:r>
+      <w:r>
+        <w:rPr>
+          <w:rFonts w:ascii="TimesNewRomanPSMT" w:hAnsi="TimesNewRomanPSMT"/>
+          <w:szCs w:val="32"/>
+        </w:rPr>
+        <w:t>(pseudo)</w:t>
+      </w:r>
+      <w:r>
+        <w:rPr>
+          <w:rFonts w:ascii="TimesNewRomanPSMT" w:hAnsi="TimesNewRomanPSMT"/>
+          <w:szCs w:val="32"/>
+        </w:rPr>
+        <w:t xml:space="preserve">random value </w:t>
+      </w:r>
+      <w:r>
+        <w:rPr>
+          <w:rFonts w:ascii="TimesNewRomanPSMT" w:hAnsi="TimesNewRomanPSMT"/>
+          <w:szCs w:val="32"/>
+        </w:rPr>
+        <w:t>in the range -999</w:t>
+      </w:r>
+      <w:r>
+        <w:rPr>
+          <w:rFonts w:ascii="TimesNewRomanPSMT" w:hAnsi="TimesNewRomanPSMT"/>
+          <w:szCs w:val="32"/>
+        </w:rPr>
+        <w:t xml:space="preserve"> through </w:t>
+      </w:r>
+      <w:r>
+        <w:rPr>
+          <w:rFonts w:ascii="TimesNewRomanPSMT" w:hAnsi="TimesNewRomanPSMT"/>
+          <w:szCs w:val="32"/>
+        </w:rPr>
+        <w:t>999, where the numbers are sometimes restricted to positive-only or negative-only, depending on the array size.</w:t>
       </w:r>
     </w:p>
     <w:p>

</xml_diff>

<commit_message>
Make board rectangular so outer and inner loops must have different limits. Also, out-of-bounds intersections are now faintly visible.
</commit_message>
<xml_diff>
--- a/Lab 6 - Arrays I.docx
+++ b/Lab 6 - Arrays I.docx
@@ -561,251 +561,6 @@
     </w:p>
     <w:p>
       <w:pPr>
-        <w:rPr>
-          <w:rFonts w:ascii="TimesNewRomanPSMT" w:hAnsi="TimesNewRomanPSMT"/>
-        </w:rPr>
-      </w:pPr>
-      <w:r>
-        <w:rPr>
-          <w:b/>
-        </w:rPr>
-        <w:t>C</w:t>
-      </w:r>
-      <w:r>
-        <w:rPr>
-          <w:b/>
-        </w:rPr>
-        <w:t xml:space="preserve">heckpoint </w:t>
-      </w:r>
-      <w:r>
-        <w:rPr>
-          <w:b/>
-        </w:rPr>
-        <w:t>1 (</w:t>
-      </w:r>
-      <w:r>
-        <w:rPr>
-          <w:b/>
-        </w:rPr>
-        <w:t>10</w:t>
-      </w:r>
-      <w:r>
-        <w:rPr>
-          <w:b/>
-        </w:rPr>
-        <w:t xml:space="preserve"> points):</w:t>
-      </w:r>
-      <w:r>
-        <w:rPr>
-          <w:rFonts w:ascii="TimesNewRomanPSMT" w:hAnsi="TimesNewRomanPSMT"/>
-        </w:rPr>
-        <w:t xml:space="preserve"> Modify the code so that it</w:t>
-      </w:r>
-      <w:r>
-        <w:rPr>
-          <w:rFonts w:ascii="TimesNewRomanPSMT" w:hAnsi="TimesNewRomanPSMT"/>
-        </w:rPr>
-        <w:t xml:space="preserve"> uses a loop to </w:t>
-      </w:r>
-      <w:r>
-        <w:rPr>
-          <w:rFonts w:ascii="TimesNewRomanPSMT" w:hAnsi="TimesNewRomanPSMT"/>
-        </w:rPr>
-        <w:t xml:space="preserve">print </w:t>
-      </w:r>
-      <w:r>
-        <w:rPr>
-          <w:rFonts w:ascii="TimesNewRomanPSMT" w:hAnsi="TimesNewRomanPSMT"/>
-        </w:rPr>
-        <w:t xml:space="preserve">out </w:t>
-      </w:r>
-      <w:r>
-        <w:rPr>
-          <w:rFonts w:ascii="TimesNewRomanPSMT" w:hAnsi="TimesNewRomanPSMT"/>
-        </w:rPr>
-        <w:t>the elements of the array</w:t>
-      </w:r>
-      <w:r>
-        <w:rPr>
-          <w:rFonts w:ascii="TimesNewRomanPSMT" w:hAnsi="TimesNewRomanPSMT"/>
-        </w:rPr>
-        <w:t xml:space="preserve"> all on one line, </w:t>
-      </w:r>
-      <w:r>
-        <w:rPr>
-          <w:rFonts w:ascii="TimesNewRomanPSMT" w:hAnsi="TimesNewRomanPSMT"/>
-        </w:rPr>
-        <w:t>with</w:t>
-      </w:r>
-      <w:r>
-        <w:rPr>
-          <w:rFonts w:ascii="TimesNewRomanPSMT" w:hAnsi="TimesNewRomanPSMT"/>
-        </w:rPr>
-        <w:t xml:space="preserve"> a single space</w:t>
-      </w:r>
-      <w:r>
-        <w:rPr>
-          <w:rFonts w:ascii="TimesNewRomanPSMT" w:hAnsi="TimesNewRomanPSMT"/>
-        </w:rPr>
-        <w:t xml:space="preserve"> after each element</w:t>
-      </w:r>
-      <w:r>
-        <w:rPr>
-          <w:rFonts w:ascii="TimesNewRomanPSMT" w:hAnsi="TimesNewRomanPSMT"/>
-        </w:rPr>
-        <w:t xml:space="preserve">. </w:t>
-      </w:r>
-      <w:r>
-        <w:rPr>
-          <w:rFonts w:ascii="TimesNewRomanPSMT" w:hAnsi="TimesNewRomanPSMT"/>
-        </w:rPr>
-        <w:t xml:space="preserve">Then use a loop to print a row of 20 dash (‘-‘) characters on the next line. </w:t>
-      </w:r>
-    </w:p>
-    <w:p>
-      <w:pPr>
-        <w:rPr>
-          <w:rFonts w:ascii="TimesNewRomanPSMT" w:hAnsi="TimesNewRomanPSMT"/>
-        </w:rPr>
-      </w:pPr>
-    </w:p>
-    <w:p>
-      <w:pPr>
-        <w:rPr>
-          <w:rFonts w:ascii="TimesNewRomanPSMT" w:hAnsi="TimesNewRomanPSMT"/>
-        </w:rPr>
-      </w:pPr>
-      <w:r>
-        <w:rPr>
-          <w:b/>
-        </w:rPr>
-        <w:t>C</w:t>
-      </w:r>
-      <w:r>
-        <w:rPr>
-          <w:b/>
-        </w:rPr>
-        <w:t xml:space="preserve">heckpoint </w:t>
-      </w:r>
-      <w:r>
-        <w:rPr>
-          <w:b/>
-        </w:rPr>
-        <w:t>2 (</w:t>
-      </w:r>
-      <w:r>
-        <w:rPr>
-          <w:b/>
-        </w:rPr>
-        <w:t>10</w:t>
-      </w:r>
-      <w:r>
-        <w:rPr>
-          <w:b/>
-        </w:rPr>
-        <w:t xml:space="preserve"> points):</w:t>
-      </w:r>
-      <w:r>
-        <w:rPr>
-          <w:rFonts w:ascii="TimesNewRomanPSMT" w:hAnsi="TimesNewRomanPSMT"/>
-        </w:rPr>
-        <w:t xml:space="preserve"> Modify the code so that it computes the </w:t>
-      </w:r>
-      <w:r>
-        <w:rPr>
-          <w:rFonts w:ascii="TimesNewRomanPSMT" w:hAnsi="TimesNewRomanPSMT"/>
-        </w:rPr>
-        <w:t>average</w:t>
-      </w:r>
-      <w:r>
-        <w:rPr>
-          <w:rFonts w:ascii="TimesNewRomanPSMT" w:hAnsi="TimesNewRomanPSMT"/>
-        </w:rPr>
-        <w:t xml:space="preserve"> of the values in the array. </w:t>
-      </w:r>
-      <w:r>
-        <w:rPr>
-          <w:rFonts w:ascii="TimesNewRomanPSMT" w:hAnsi="TimesNewRomanPSMT"/>
-        </w:rPr>
-        <w:t xml:space="preserve">The </w:t>
-      </w:r>
-      <w:r>
-        <w:rPr>
-          <w:rFonts w:ascii="TimesNewRomanPSMT" w:hAnsi="TimesNewRomanPSMT"/>
-        </w:rPr>
-        <w:t>average</w:t>
-      </w:r>
-      <w:r>
-        <w:rPr>
-          <w:rFonts w:ascii="TimesNewRomanPSMT" w:hAnsi="TimesNewRomanPSMT"/>
-        </w:rPr>
-        <w:t xml:space="preserve"> must be </w:t>
-      </w:r>
-      <w:r>
-        <w:rPr>
-          <w:rFonts w:ascii="TimesNewRomanPSMT" w:hAnsi="TimesNewRomanPSMT"/>
-          <w:u w:val="single"/>
-        </w:rPr>
-        <w:t>as precise as possible</w:t>
-      </w:r>
-      <w:r>
-        <w:rPr>
-          <w:rFonts w:ascii="TimesNewRomanPSMT" w:hAnsi="TimesNewRomanPSMT"/>
-        </w:rPr>
-        <w:t xml:space="preserve"> (i.e. reporting 20 as the average is</w:t>
-      </w:r>
-      <w:r>
-        <w:rPr>
-          <w:rFonts w:ascii="TimesNewRomanPSMT" w:hAnsi="TimesNewRomanPSMT"/>
-        </w:rPr>
-        <w:t>n’t good enough</w:t>
-      </w:r>
-      <w:r>
-        <w:rPr>
-          <w:rFonts w:ascii="TimesNewRomanPSMT" w:hAnsi="TimesNewRomanPSMT"/>
-        </w:rPr>
-        <w:t xml:space="preserve"> when 20.543 is</w:t>
-      </w:r>
-      <w:r>
-        <w:rPr>
-          <w:rFonts w:ascii="TimesNewRomanPSMT" w:hAnsi="TimesNewRomanPSMT"/>
-        </w:rPr>
-        <w:t xml:space="preserve"> actually</w:t>
-      </w:r>
-      <w:r>
-        <w:rPr>
-          <w:rFonts w:ascii="TimesNewRomanPSMT" w:hAnsi="TimesNewRomanPSMT"/>
-        </w:rPr>
-        <w:t xml:space="preserve"> the </w:t>
-      </w:r>
-      <w:r>
-        <w:rPr>
-          <w:rFonts w:ascii="TimesNewRomanPSMT" w:hAnsi="TimesNewRomanPSMT"/>
-        </w:rPr>
-        <w:t>average</w:t>
-      </w:r>
-      <w:r>
-        <w:rPr>
-          <w:rFonts w:ascii="TimesNewRomanPSMT" w:hAnsi="TimesNewRomanPSMT"/>
-        </w:rPr>
-        <w:t xml:space="preserve">). </w:t>
-      </w:r>
-      <w:r>
-        <w:rPr>
-          <w:rFonts w:ascii="TimesNewRomanPSMT" w:hAnsi="TimesNewRomanPSMT"/>
-        </w:rPr>
-        <w:t>Uncomment the line that prints this value to the terminal window and edit it so that it works with your code.</w:t>
-      </w:r>
-    </w:p>
-    <w:p>
-      <w:pPr>
-        <w:rPr>
-          <w:rFonts w:ascii="TimesNewRomanPSMT" w:hAnsi="TimesNewRomanPSMT"/>
-        </w:rPr>
-      </w:pPr>
-    </w:p>
-    <w:p>
-      <w:pPr>
         <w:widowControl w:val="0"/>
         <w:autoSpaceDE w:val="0"/>
         <w:autoSpaceDN w:val="0"/>
@@ -818,7 +573,19 @@
         <w:rPr>
           <w:b/>
         </w:rPr>
-        <w:t>Checkpoint 3 (</w:t>
+        <w:t xml:space="preserve">Checkpoint </w:t>
+      </w:r>
+      <w:r>
+        <w:rPr>
+          <w:b/>
+        </w:rPr>
+        <w:t>1</w:t>
+      </w:r>
+      <w:r>
+        <w:rPr>
+          <w:b/>
+        </w:rPr>
+        <w:t xml:space="preserve"> (</w:t>
       </w:r>
       <w:r>
         <w:rPr>
@@ -848,25 +615,31 @@
         <w:rPr>
           <w:bCs/>
         </w:rPr>
-        <w:t>Use the debugger to examine an array</w:t>
+        <w:t xml:space="preserve">Use the debugger to examine </w:t>
       </w:r>
       <w:r>
         <w:rPr>
           <w:bCs/>
         </w:rPr>
+        <w:t>the</w:t>
+      </w:r>
+      <w:r>
+        <w:rPr>
+          <w:bCs/>
+        </w:rPr>
+        <w:t xml:space="preserve"> array</w:t>
+      </w:r>
+      <w:r>
+        <w:rPr>
+          <w:bCs/>
+        </w:rPr>
         <w:t xml:space="preserve"> by s</w:t>
       </w:r>
       <w:r>
         <w:rPr>
           <w:rFonts w:ascii="TimesNewRomanPSMT" w:hAnsi="TimesNewRomanPSMT"/>
         </w:rPr>
-        <w:t xml:space="preserve">etting a breakpoint somewhere in the code you added. You can add a breakpoint </w:t>
-      </w:r>
-      <w:r>
-        <w:rPr>
-          <w:rFonts w:ascii="TimesNewRomanPSMT" w:hAnsi="TimesNewRomanPSMT"/>
-        </w:rPr>
-        <w:t xml:space="preserve">in </w:t>
+        <w:t xml:space="preserve">etting a breakpoint somewhere in the code you added. You can add a breakpoint in </w:t>
       </w:r>
       <w:proofErr w:type="spellStart"/>
       <w:r>
@@ -880,201 +653,327 @@
         <w:rPr>
           <w:rFonts w:ascii="TimesNewRomanPSMT" w:hAnsi="TimesNewRomanPSMT"/>
         </w:rPr>
+        <w:t xml:space="preserve"> by clicking in the left margin where the line numbers appear – a STOP sign will appear. If it isn’t working, remember: (1) the code must be compiled before you can set a breakpoint, and (2) you cannot set a breakpoint on a comment line or a blank line. </w:t>
+      </w:r>
+    </w:p>
+    <w:p>
+      <w:pPr>
+        <w:rPr>
+          <w:rFonts w:ascii="TimesNewRomanPSMT" w:hAnsi="TimesNewRomanPSMT"/>
+        </w:rPr>
+      </w:pPr>
+    </w:p>
+    <w:p>
+      <w:pPr>
+        <w:rPr>
+          <w:rFonts w:ascii="TimesNewRomanPSMT" w:hAnsi="TimesNewRomanPSMT"/>
+        </w:rPr>
+      </w:pPr>
+      <w:r>
+        <w:rPr>
+          <w:rFonts w:ascii="TimesNewRomanPSMT" w:hAnsi="TimesNewRomanPSMT"/>
+        </w:rPr>
+        <w:t xml:space="preserve">After you have set the breakpoint, run the program. When the breakpoint is hit, the debugger window should open. </w:t>
+      </w:r>
+      <w:r>
+        <w:rPr>
+          <w:rFonts w:ascii="TimesNewRomanPSMT" w:hAnsi="TimesNewRomanPSMT"/>
+        </w:rPr>
+        <w:t xml:space="preserve">Press “Step” until the line that creates the array has run. </w:t>
+      </w:r>
+      <w:r>
+        <w:rPr>
+          <w:rFonts w:ascii="TimesNewRomanPSMT" w:hAnsi="TimesNewRomanPSMT"/>
+        </w:rPr>
+        <w:t>Double-click on the array’s name in the debugger window. A window will pop up that displays the array’s contents.</w:t>
+      </w:r>
+    </w:p>
+    <w:p>
+      <w:pPr>
+        <w:rPr>
+          <w:b/>
+        </w:rPr>
+      </w:pPr>
+    </w:p>
+    <w:p>
+      <w:pPr>
+        <w:rPr>
+          <w:rFonts w:ascii="TimesNewRomanPSMT" w:hAnsi="TimesNewRomanPSMT"/>
+        </w:rPr>
+      </w:pPr>
+      <w:r>
+        <w:rPr>
+          <w:b/>
+        </w:rPr>
+        <w:t>C</w:t>
+      </w:r>
+      <w:r>
+        <w:rPr>
+          <w:b/>
+        </w:rPr>
+        <w:t xml:space="preserve">heckpoint </w:t>
+      </w:r>
+      <w:r>
+        <w:rPr>
+          <w:b/>
+        </w:rPr>
+        <w:t>2</w:t>
+      </w:r>
+      <w:r>
+        <w:rPr>
+          <w:b/>
+        </w:rPr>
+        <w:t xml:space="preserve"> (</w:t>
+      </w:r>
+      <w:r>
+        <w:rPr>
+          <w:b/>
+        </w:rPr>
+        <w:t>10</w:t>
+      </w:r>
+      <w:r>
+        <w:rPr>
+          <w:b/>
+        </w:rPr>
+        <w:t xml:space="preserve"> points):</w:t>
+      </w:r>
+      <w:r>
+        <w:rPr>
+          <w:rFonts w:ascii="TimesNewRomanPSMT" w:hAnsi="TimesNewRomanPSMT"/>
+        </w:rPr>
+        <w:t xml:space="preserve"> Modify the code so that it</w:t>
+      </w:r>
+      <w:r>
+        <w:rPr>
+          <w:rFonts w:ascii="TimesNewRomanPSMT" w:hAnsi="TimesNewRomanPSMT"/>
+        </w:rPr>
+        <w:t xml:space="preserve"> uses a loop to </w:t>
+      </w:r>
+      <w:r>
+        <w:rPr>
+          <w:rFonts w:ascii="TimesNewRomanPSMT" w:hAnsi="TimesNewRomanPSMT"/>
+        </w:rPr>
+        <w:t xml:space="preserve">print </w:t>
+      </w:r>
+      <w:r>
+        <w:rPr>
+          <w:rFonts w:ascii="TimesNewRomanPSMT" w:hAnsi="TimesNewRomanPSMT"/>
+        </w:rPr>
+        <w:t xml:space="preserve">out </w:t>
+      </w:r>
+      <w:r>
+        <w:rPr>
+          <w:rFonts w:ascii="TimesNewRomanPSMT" w:hAnsi="TimesNewRomanPSMT"/>
+        </w:rPr>
+        <w:t>the elements of the array</w:t>
+      </w:r>
+      <w:r>
+        <w:rPr>
+          <w:rFonts w:ascii="TimesNewRomanPSMT" w:hAnsi="TimesNewRomanPSMT"/>
+        </w:rPr>
+        <w:t xml:space="preserve"> all on one line, </w:t>
+      </w:r>
+      <w:r>
+        <w:rPr>
+          <w:rFonts w:ascii="TimesNewRomanPSMT" w:hAnsi="TimesNewRomanPSMT"/>
+        </w:rPr>
+        <w:t>with</w:t>
+      </w:r>
+      <w:r>
+        <w:rPr>
+          <w:rFonts w:ascii="TimesNewRomanPSMT" w:hAnsi="TimesNewRomanPSMT"/>
+        </w:rPr>
+        <w:t xml:space="preserve"> a single space</w:t>
+      </w:r>
+      <w:r>
+        <w:rPr>
+          <w:rFonts w:ascii="TimesNewRomanPSMT" w:hAnsi="TimesNewRomanPSMT"/>
+        </w:rPr>
+        <w:t xml:space="preserve"> after each element</w:t>
+      </w:r>
+      <w:r>
+        <w:rPr>
+          <w:rFonts w:ascii="TimesNewRomanPSMT" w:hAnsi="TimesNewRomanPSMT"/>
+        </w:rPr>
+        <w:t xml:space="preserve">. </w:t>
+      </w:r>
+      <w:r>
+        <w:rPr>
+          <w:rFonts w:ascii="TimesNewRomanPSMT" w:hAnsi="TimesNewRomanPSMT"/>
+        </w:rPr>
+        <w:t xml:space="preserve">Then use a loop to print a row of 20 dash (‘-‘) characters on the next line. </w:t>
+      </w:r>
+    </w:p>
+    <w:p>
+      <w:pPr>
+        <w:rPr>
+          <w:rFonts w:ascii="TimesNewRomanPSMT" w:hAnsi="TimesNewRomanPSMT"/>
+        </w:rPr>
+      </w:pPr>
+    </w:p>
+    <w:p>
+      <w:pPr>
+        <w:rPr>
+          <w:rFonts w:ascii="TimesNewRomanPSMT" w:hAnsi="TimesNewRomanPSMT"/>
+        </w:rPr>
+      </w:pPr>
+      <w:r>
+        <w:rPr>
+          <w:b/>
+        </w:rPr>
+        <w:t>C</w:t>
+      </w:r>
+      <w:r>
+        <w:rPr>
+          <w:b/>
+        </w:rPr>
+        <w:t xml:space="preserve">heckpoint </w:t>
+      </w:r>
+      <w:r>
+        <w:rPr>
+          <w:b/>
+        </w:rPr>
+        <w:t>3</w:t>
+      </w:r>
+      <w:r>
+        <w:rPr>
+          <w:b/>
+        </w:rPr>
+        <w:t xml:space="preserve"> (</w:t>
+      </w:r>
+      <w:r>
+        <w:rPr>
+          <w:b/>
+        </w:rPr>
+        <w:t>10</w:t>
+      </w:r>
+      <w:r>
+        <w:rPr>
+          <w:b/>
+        </w:rPr>
+        <w:t xml:space="preserve"> points):</w:t>
+      </w:r>
+      <w:r>
+        <w:rPr>
+          <w:rFonts w:ascii="TimesNewRomanPSMT" w:hAnsi="TimesNewRomanPSMT"/>
+        </w:rPr>
+        <w:t xml:space="preserve"> Modify the code so that it computes the </w:t>
+      </w:r>
+      <w:r>
+        <w:rPr>
+          <w:rFonts w:ascii="TimesNewRomanPSMT" w:hAnsi="TimesNewRomanPSMT"/>
+        </w:rPr>
+        <w:t>average</w:t>
+      </w:r>
+      <w:r>
+        <w:rPr>
+          <w:rFonts w:ascii="TimesNewRomanPSMT" w:hAnsi="TimesNewRomanPSMT"/>
+        </w:rPr>
+        <w:t xml:space="preserve"> of the values in the array. </w:t>
+      </w:r>
+      <w:r>
+        <w:rPr>
+          <w:rFonts w:ascii="TimesNewRomanPSMT" w:hAnsi="TimesNewRomanPSMT"/>
+        </w:rPr>
+        <w:t>HINT: keep track of the sum-so-far of the array as you loop through it</w:t>
+      </w:r>
+      <w:r>
+        <w:rPr>
+          <w:rFonts w:ascii="TimesNewRomanPSMT" w:hAnsi="TimesNewRomanPSMT"/>
+        </w:rPr>
+        <w:t>, then compute the average at the end</w:t>
+      </w:r>
+      <w:r>
+        <w:rPr>
+          <w:rFonts w:ascii="TimesNewRomanPSMT" w:hAnsi="TimesNewRomanPSMT"/>
+        </w:rPr>
+        <w:t xml:space="preserve">. </w:t>
+      </w:r>
+      <w:r>
+        <w:rPr>
+          <w:rFonts w:ascii="TimesNewRomanPSMT" w:hAnsi="TimesNewRomanPSMT"/>
+        </w:rPr>
+        <w:t xml:space="preserve">The </w:t>
+      </w:r>
+      <w:r>
+        <w:rPr>
+          <w:rFonts w:ascii="TimesNewRomanPSMT" w:hAnsi="TimesNewRomanPSMT"/>
+        </w:rPr>
+        <w:t>average</w:t>
+      </w:r>
+      <w:r>
+        <w:rPr>
+          <w:rFonts w:ascii="TimesNewRomanPSMT" w:hAnsi="TimesNewRomanPSMT"/>
+        </w:rPr>
+        <w:t xml:space="preserve"> must be </w:t>
+      </w:r>
+      <w:r>
+        <w:rPr>
+          <w:rFonts w:ascii="TimesNewRomanPSMT" w:hAnsi="TimesNewRomanPSMT"/>
+          <w:u w:val="single"/>
+        </w:rPr>
+        <w:t>as precise as possible</w:t>
+      </w:r>
+      <w:r>
+        <w:rPr>
+          <w:rFonts w:ascii="TimesNewRomanPSMT" w:hAnsi="TimesNewRomanPSMT"/>
+        </w:rPr>
+        <w:t xml:space="preserve"> (i.e. reporting 20 as the average is</w:t>
+      </w:r>
+      <w:r>
+        <w:rPr>
+          <w:rFonts w:ascii="TimesNewRomanPSMT" w:hAnsi="TimesNewRomanPSMT"/>
+        </w:rPr>
+        <w:t>n’t good enough</w:t>
+      </w:r>
+      <w:r>
+        <w:rPr>
+          <w:rFonts w:ascii="TimesNewRomanPSMT" w:hAnsi="TimesNewRomanPSMT"/>
+        </w:rPr>
+        <w:t xml:space="preserve"> when 20.543 is</w:t>
+      </w:r>
+      <w:r>
+        <w:rPr>
+          <w:rFonts w:ascii="TimesNewRomanPSMT" w:hAnsi="TimesNewRomanPSMT"/>
+        </w:rPr>
+        <w:t xml:space="preserve"> actually</w:t>
+      </w:r>
+      <w:r>
+        <w:rPr>
+          <w:rFonts w:ascii="TimesNewRomanPSMT" w:hAnsi="TimesNewRomanPSMT"/>
+        </w:rPr>
+        <w:t xml:space="preserve"> the </w:t>
+      </w:r>
+      <w:r>
+        <w:rPr>
+          <w:rFonts w:ascii="TimesNewRomanPSMT" w:hAnsi="TimesNewRomanPSMT"/>
+        </w:rPr>
+        <w:t>average</w:t>
+      </w:r>
+      <w:r>
+        <w:rPr>
+          <w:rFonts w:ascii="TimesNewRomanPSMT" w:hAnsi="TimesNewRomanPSMT"/>
+        </w:rPr>
+        <w:t xml:space="preserve">). </w:t>
+      </w:r>
+      <w:r>
+        <w:rPr>
+          <w:rFonts w:ascii="TimesNewRomanPSMT" w:hAnsi="TimesNewRomanPSMT"/>
+        </w:rPr>
+        <w:t xml:space="preserve">Uncomment </w:t>
+      </w:r>
+      <w:r>
+        <w:rPr>
+          <w:rFonts w:ascii="TimesNewRomanPSMT" w:hAnsi="TimesNewRomanPSMT"/>
+        </w:rPr>
+        <w:lastRenderedPageBreak/>
+        <w:t>the line that prints this value to the terminal window and edit it so that it works with your code.</w:t>
+      </w:r>
+      <w:r>
+        <w:rPr>
+          <w:rFonts w:ascii="TimesNewRomanPSMT" w:hAnsi="TimesNewRomanPSMT"/>
+        </w:rPr>
         <w:t xml:space="preserve"> </w:t>
-      </w:r>
-      <w:r>
-        <w:rPr>
-          <w:rFonts w:ascii="TimesNewRomanPSMT" w:hAnsi="TimesNewRomanPSMT"/>
-        </w:rPr>
-        <w:t>by clicking in the left margin where the line numbers appear</w:t>
-      </w:r>
-      <w:r>
-        <w:rPr>
-          <w:rFonts w:ascii="TimesNewRomanPSMT" w:hAnsi="TimesNewRomanPSMT"/>
-        </w:rPr>
-        <w:t xml:space="preserve"> – a STOP sign will appear</w:t>
-      </w:r>
-      <w:r>
-        <w:rPr>
-          <w:rFonts w:ascii="TimesNewRomanPSMT" w:hAnsi="TimesNewRomanPSMT"/>
-        </w:rPr>
-        <w:t>.</w:t>
-      </w:r>
-      <w:r>
-        <w:rPr>
-          <w:rFonts w:ascii="TimesNewRomanPSMT" w:hAnsi="TimesNewRomanPSMT"/>
-        </w:rPr>
-        <w:t xml:space="preserve"> If it isn’t working, remember: (1) t</w:t>
-      </w:r>
-      <w:r>
-        <w:rPr>
-          <w:rFonts w:ascii="TimesNewRomanPSMT" w:hAnsi="TimesNewRomanPSMT"/>
-        </w:rPr>
-        <w:t xml:space="preserve">he code must </w:t>
-      </w:r>
-      <w:r>
-        <w:rPr>
-          <w:rFonts w:ascii="TimesNewRomanPSMT" w:hAnsi="TimesNewRomanPSMT"/>
-        </w:rPr>
-        <w:t>be compiled before you can set a breakpoint</w:t>
-      </w:r>
-      <w:r>
-        <w:rPr>
-          <w:rFonts w:ascii="TimesNewRomanPSMT" w:hAnsi="TimesNewRomanPSMT"/>
-        </w:rPr>
-        <w:t>, and (2)</w:t>
-      </w:r>
-      <w:r>
-        <w:rPr>
-          <w:rFonts w:ascii="TimesNewRomanPSMT" w:hAnsi="TimesNewRomanPSMT"/>
-        </w:rPr>
-        <w:t xml:space="preserve"> </w:t>
-      </w:r>
-      <w:r>
-        <w:rPr>
-          <w:rFonts w:ascii="TimesNewRomanPSMT" w:hAnsi="TimesNewRomanPSMT"/>
-        </w:rPr>
-        <w:t>y</w:t>
-      </w:r>
-      <w:r>
-        <w:rPr>
-          <w:rFonts w:ascii="TimesNewRomanPSMT" w:hAnsi="TimesNewRomanPSMT"/>
-        </w:rPr>
-        <w:t>ou can</w:t>
-      </w:r>
-      <w:r>
-        <w:rPr>
-          <w:rFonts w:ascii="TimesNewRomanPSMT" w:hAnsi="TimesNewRomanPSMT"/>
-        </w:rPr>
-        <w:t xml:space="preserve">not </w:t>
-      </w:r>
-      <w:r>
-        <w:rPr>
-          <w:rFonts w:ascii="TimesNewRomanPSMT" w:hAnsi="TimesNewRomanPSMT"/>
-        </w:rPr>
-        <w:t xml:space="preserve">set </w:t>
-      </w:r>
-      <w:r>
-        <w:rPr>
-          <w:rFonts w:ascii="TimesNewRomanPSMT" w:hAnsi="TimesNewRomanPSMT"/>
-        </w:rPr>
-        <w:t xml:space="preserve">a </w:t>
-      </w:r>
-      <w:r>
-        <w:rPr>
-          <w:rFonts w:ascii="TimesNewRomanPSMT" w:hAnsi="TimesNewRomanPSMT"/>
-        </w:rPr>
-        <w:t>breakpoint on a comment line</w:t>
-      </w:r>
-      <w:r>
-        <w:rPr>
-          <w:rFonts w:ascii="TimesNewRomanPSMT" w:hAnsi="TimesNewRomanPSMT"/>
-        </w:rPr>
-        <w:t xml:space="preserve"> or a blank line</w:t>
-      </w:r>
-      <w:r>
-        <w:rPr>
-          <w:rFonts w:ascii="TimesNewRomanPSMT" w:hAnsi="TimesNewRomanPSMT"/>
-        </w:rPr>
-        <w:t xml:space="preserve">. </w:t>
-      </w:r>
-    </w:p>
-    <w:p>
-      <w:pPr>
-        <w:rPr>
-          <w:rFonts w:ascii="TimesNewRomanPSMT" w:hAnsi="TimesNewRomanPSMT"/>
-        </w:rPr>
-      </w:pPr>
-    </w:p>
-    <w:p>
-      <w:pPr>
-        <w:rPr>
-          <w:rFonts w:ascii="TimesNewRomanPSMT" w:hAnsi="TimesNewRomanPSMT"/>
-        </w:rPr>
-      </w:pPr>
-      <w:r>
-        <w:rPr>
-          <w:rFonts w:ascii="TimesNewRomanPSMT" w:hAnsi="TimesNewRomanPSMT"/>
-        </w:rPr>
-        <w:t>After you have set the breakpoint, r</w:t>
-      </w:r>
-      <w:r>
-        <w:rPr>
-          <w:rFonts w:ascii="TimesNewRomanPSMT" w:hAnsi="TimesNewRomanPSMT"/>
-        </w:rPr>
-        <w:t>un the program.</w:t>
-      </w:r>
-      <w:r>
-        <w:rPr>
-          <w:rFonts w:ascii="TimesNewRomanPSMT" w:hAnsi="TimesNewRomanPSMT"/>
-        </w:rPr>
-        <w:t xml:space="preserve"> </w:t>
-      </w:r>
-      <w:r>
-        <w:rPr>
-          <w:rFonts w:ascii="TimesNewRomanPSMT" w:hAnsi="TimesNewRomanPSMT"/>
-        </w:rPr>
-        <w:t>When the breakpoint is hit,</w:t>
-      </w:r>
-      <w:r>
-        <w:rPr>
-          <w:rFonts w:ascii="TimesNewRomanPSMT" w:hAnsi="TimesNewRomanPSMT"/>
-        </w:rPr>
-        <w:t xml:space="preserve"> the debugger window should open.</w:t>
-      </w:r>
-      <w:r>
-        <w:rPr>
-          <w:rFonts w:ascii="TimesNewRomanPSMT" w:hAnsi="TimesNewRomanPSMT"/>
-        </w:rPr>
-        <w:t xml:space="preserve"> </w:t>
-      </w:r>
-      <w:r>
-        <w:rPr>
-          <w:rFonts w:ascii="TimesNewRomanPSMT" w:hAnsi="TimesNewRomanPSMT"/>
-        </w:rPr>
-        <w:t>D</w:t>
-      </w:r>
-      <w:r>
-        <w:rPr>
-          <w:rFonts w:ascii="TimesNewRomanPSMT" w:hAnsi="TimesNewRomanPSMT"/>
-        </w:rPr>
-        <w:t xml:space="preserve">ouble-click on the array’s name in the debugger </w:t>
-      </w:r>
-      <w:r>
-        <w:rPr>
-          <w:rFonts w:ascii="TimesNewRomanPSMT" w:hAnsi="TimesNewRomanPSMT"/>
-        </w:rPr>
-        <w:t>w</w:t>
-      </w:r>
-      <w:r>
-        <w:rPr>
-          <w:rFonts w:ascii="TimesNewRomanPSMT" w:hAnsi="TimesNewRomanPSMT"/>
-        </w:rPr>
-        <w:t>indow.</w:t>
-      </w:r>
-      <w:r>
-        <w:rPr>
-          <w:rFonts w:ascii="TimesNewRomanPSMT" w:hAnsi="TimesNewRomanPSMT"/>
-        </w:rPr>
-        <w:t xml:space="preserve"> </w:t>
-      </w:r>
-      <w:r>
-        <w:rPr>
-          <w:rFonts w:ascii="TimesNewRomanPSMT" w:hAnsi="TimesNewRomanPSMT"/>
-        </w:rPr>
-        <w:t xml:space="preserve">A window will pop up that displays the </w:t>
-      </w:r>
-      <w:r>
-        <w:rPr>
-          <w:rFonts w:ascii="TimesNewRomanPSMT" w:hAnsi="TimesNewRomanPSMT"/>
-        </w:rPr>
-        <w:t>array’s</w:t>
-      </w:r>
-      <w:r>
-        <w:rPr>
-          <w:rFonts w:ascii="TimesNewRomanPSMT" w:hAnsi="TimesNewRomanPSMT"/>
-        </w:rPr>
-        <w:t xml:space="preserve"> contents.</w:t>
       </w:r>
     </w:p>
     <w:p>
@@ -1143,7 +1042,21 @@
           <w:rFonts w:ascii="TimesNewRomanPSMT" w:hAnsi="TimesNewRomanPSMT"/>
           <w:szCs w:val="32"/>
         </w:rPr>
-        <w:t xml:space="preserve"> Uncomment the line that prints this value to the terminal window and edit it so that it works with your code. </w:t>
+        <w:t xml:space="preserve"> </w:t>
+      </w:r>
+      <w:r>
+        <w:rPr>
+          <w:rFonts w:ascii="TimesNewRomanPSMT" w:hAnsi="TimesNewRomanPSMT"/>
+          <w:szCs w:val="32"/>
+        </w:rPr>
+        <w:t xml:space="preserve">HINT: what could you keep track of this time instead of the sum-so-far? </w:t>
+      </w:r>
+      <w:r>
+        <w:rPr>
+          <w:rFonts w:ascii="TimesNewRomanPSMT" w:hAnsi="TimesNewRomanPSMT"/>
+          <w:szCs w:val="32"/>
+        </w:rPr>
+        <w:t xml:space="preserve">Uncomment the line that prints this value to the terminal window and edit it so that it works with your code. </w:t>
       </w:r>
     </w:p>
     <w:p>
@@ -2025,7 +1938,29 @@
           <w:rFonts w:ascii="TimesNewRomanPSMT" w:hAnsi="TimesNewRomanPSMT"/>
           <w:szCs w:val="32"/>
         </w:rPr>
-        <w:t xml:space="preserve"> board that by default is 19x19. The only button that is implemented is the "Spiral" button. Pressing this will cause two spirals made out of Go pieces to be drawn on the board. No other functionality is currently implemented.</w:t>
+        <w:t xml:space="preserve"> board that by default is 1</w:t>
+      </w:r>
+      <w:r>
+        <w:rPr>
+          <w:rFonts w:ascii="TimesNewRomanPSMT" w:hAnsi="TimesNewRomanPSMT"/>
+          <w:szCs w:val="32"/>
+        </w:rPr>
+        <w:t>0 x 20</w:t>
+      </w:r>
+      <w:r>
+        <w:rPr>
+          <w:rFonts w:ascii="TimesNewRomanPSMT" w:hAnsi="TimesNewRomanPSMT"/>
+          <w:szCs w:val="32"/>
+        </w:rPr>
+        <w:t xml:space="preserve">. The only button that is </w:t>
+      </w:r>
+      <w:r>
+        <w:rPr>
+          <w:rFonts w:ascii="TimesNewRomanPSMT" w:hAnsi="TimesNewRomanPSMT"/>
+          <w:szCs w:val="32"/>
+        </w:rPr>
+        <w:lastRenderedPageBreak/>
+        <w:t>implemented is the "Spiral" button. Pressing this will cause two spirals made out of Go pieces to be drawn on the board. No other functionality is currently implemented.</w:t>
       </w:r>
     </w:p>
     <w:p>
@@ -2541,6 +2476,70 @@
         <w:rPr>
           <w:rFonts w:ascii="TimesNewRomanPSMT" w:hAnsi="TimesNewRomanPSMT"/>
           <w:szCs w:val="32"/>
+          <w:u w:val="single"/>
+        </w:rPr>
+        <w:t xml:space="preserve"> You will need to know the difference between </w:t>
+      </w:r>
+      <w:proofErr w:type="spellStart"/>
+      <w:proofErr w:type="gramStart"/>
+      <w:r>
+        <w:rPr>
+          <w:rFonts w:ascii="Courier New" w:hAnsi="Courier New" w:cs="Courier New"/>
+          <w:szCs w:val="32"/>
+          <w:u w:val="single"/>
+        </w:rPr>
+        <w:t>board.length</w:t>
+      </w:r>
+      <w:proofErr w:type="spellEnd"/>
+      <w:proofErr w:type="gramEnd"/>
+      <w:r>
+        <w:rPr>
+          <w:rFonts w:ascii="TimesNewRomanPSMT" w:hAnsi="TimesNewRomanPSMT"/>
+          <w:szCs w:val="32"/>
+          <w:u w:val="single"/>
+        </w:rPr>
+        <w:t xml:space="preserve"> and </w:t>
+      </w:r>
+      <w:proofErr w:type="gramStart"/>
+      <w:r>
+        <w:rPr>
+          <w:rFonts w:ascii="Courier New" w:hAnsi="Courier New" w:cs="Courier New"/>
+          <w:szCs w:val="32"/>
+          <w:u w:val="single"/>
+        </w:rPr>
+        <w:t>board[</w:t>
+      </w:r>
+      <w:proofErr w:type="gramEnd"/>
+      <w:r>
+        <w:rPr>
+          <w:rFonts w:ascii="Courier New" w:hAnsi="Courier New" w:cs="Courier New"/>
+          <w:szCs w:val="32"/>
+          <w:u w:val="single"/>
+        </w:rPr>
+        <w:t>0</w:t>
+      </w:r>
+      <w:proofErr w:type="gramStart"/>
+      <w:r>
+        <w:rPr>
+          <w:rFonts w:ascii="Courier New" w:hAnsi="Courier New" w:cs="Courier New"/>
+          <w:szCs w:val="32"/>
+          <w:u w:val="single"/>
+        </w:rPr>
+        <w:t>].length</w:t>
+      </w:r>
+      <w:proofErr w:type="gramEnd"/>
+      <w:r>
+        <w:rPr>
+          <w:rFonts w:ascii="TimesNewRomanPSMT" w:hAnsi="TimesNewRomanPSMT"/>
+          <w:szCs w:val="32"/>
+          <w:u w:val="single"/>
+        </w:rPr>
+        <w:t xml:space="preserve">. </w:t>
+      </w:r>
+      <w:r>
+        <w:rPr>
+          <w:rFonts w:ascii="TimesNewRomanPSMT" w:hAnsi="TimesNewRomanPSMT"/>
+          <w:szCs w:val="32"/>
         </w:rPr>
         <w:t xml:space="preserve"> </w:t>
       </w:r>
@@ -2743,7 +2742,15 @@
           <w:rFonts w:ascii="TimesNewRomanPSMT" w:hAnsi="TimesNewRomanPSMT"/>
           <w:szCs w:val="32"/>
         </w:rPr>
-        <w:t xml:space="preserve"> whenever the mouse is pressed at a legal intersection:</w:t>
+        <w:t xml:space="preserve"> whenever the mouse is </w:t>
+      </w:r>
+      <w:r>
+        <w:rPr>
+          <w:rFonts w:ascii="TimesNewRomanPSMT" w:hAnsi="TimesNewRomanPSMT"/>
+          <w:szCs w:val="32"/>
+        </w:rPr>
+        <w:lastRenderedPageBreak/>
+        <w:t>pressed at a legal intersection:</w:t>
       </w:r>
     </w:p>
     <w:p>
@@ -2929,41 +2936,9 @@
         <w:autoSpaceDE w:val="0"/>
         <w:autoSpaceDN w:val="0"/>
         <w:adjustRightInd w:val="0"/>
-        <w:rPr>
-          <w:rFonts w:ascii="TimesNewRomanPSMT" w:hAnsi="TimesNewRomanPSMT"/>
-          <w:szCs w:val="32"/>
-        </w:rPr>
-      </w:pPr>
-      <w:r>
-        <w:rPr>
-          <w:rFonts w:ascii="TimesNewRomanPSMT" w:hAnsi="TimesNewRomanPSMT"/>
-          <w:szCs w:val="32"/>
-          <w:u w:val="single"/>
-        </w:rPr>
-        <w:t xml:space="preserve">Do not hardcode the dimensions of the board to make this </w:t>
-      </w:r>
-      <w:r>
-        <w:rPr>
-          <w:rFonts w:ascii="TimesNewRomanPSMT" w:hAnsi="TimesNewRomanPSMT"/>
-          <w:szCs w:val="32"/>
-          <w:u w:val="single"/>
-        </w:rPr>
-        <w:t>work</w:t>
-      </w:r>
-      <w:r>
-        <w:rPr>
-          <w:rFonts w:ascii="TimesNewRomanPSMT" w:hAnsi="TimesNewRomanPSMT"/>
-          <w:szCs w:val="32"/>
-          <w:u w:val="single"/>
-        </w:rPr>
-        <w:t>.</w:t>
-      </w:r>
-      <w:r>
-        <w:rPr>
-          <w:rFonts w:ascii="TimesNewRomanPSMT" w:hAnsi="TimesNewRomanPSMT"/>
-          <w:szCs w:val="32"/>
-        </w:rPr>
-        <w:t xml:space="preserve"> </w:t>
+      </w:pPr>
+      <w:r>
+        <w:t>To get credit for this checkpoint:</w:t>
       </w:r>
     </w:p>
     <w:p>
@@ -2972,102 +2947,236 @@
         <w:autoSpaceDE w:val="0"/>
         <w:autoSpaceDN w:val="0"/>
         <w:adjustRightInd w:val="0"/>
-        <w:rPr>
-          <w:rFonts w:ascii="TimesNewRomanPSMT" w:hAnsi="TimesNewRomanPSMT"/>
-          <w:szCs w:val="32"/>
-        </w:rPr>
-      </w:pPr>
-    </w:p>
-    <w:p>
-      <w:pPr>
-        <w:rPr>
-          <w:b/>
-        </w:rPr>
-      </w:pPr>
-    </w:p>
-    <w:p>
-      <w:pPr>
-        <w:rPr>
-          <w:rFonts w:ascii="TimesNewRomanPSMT" w:hAnsi="TimesNewRomanPSMT"/>
-        </w:rPr>
-      </w:pPr>
-      <w:r>
-        <w:rPr>
-          <w:b/>
-        </w:rPr>
-        <w:t>C</w:t>
-      </w:r>
-      <w:r>
-        <w:rPr>
-          <w:b/>
-        </w:rPr>
-        <w:t xml:space="preserve">heckpoint </w:t>
-      </w:r>
-      <w:r>
-        <w:rPr>
-          <w:b/>
-        </w:rPr>
-        <w:t>10</w:t>
-      </w:r>
-      <w:r>
-        <w:rPr>
-          <w:b/>
-        </w:rPr>
-        <w:t xml:space="preserve"> (10 points):</w:t>
-      </w:r>
+      </w:pPr>
+    </w:p>
+    <w:p>
+      <w:pPr>
+        <w:pStyle w:val="ListParagraph"/>
+        <w:widowControl w:val="0"/>
+        <w:numPr>
+          <w:ilvl w:val="0"/>
+          <w:numId w:val="4"/>
+        </w:numPr>
+        <w:autoSpaceDE w:val="0"/>
+        <w:autoSpaceDN w:val="0"/>
+        <w:adjustRightInd w:val="0"/>
+        <w:rPr>
+          <w:rFonts w:ascii="TimesNewRomanPSMT" w:hAnsi="TimesNewRomanPSMT"/>
+          <w:szCs w:val="32"/>
+        </w:rPr>
+      </w:pPr>
+      <w:r>
+        <w:t>Y</w:t>
+      </w:r>
+      <w:r>
+        <w:t xml:space="preserve">ou </w:t>
+      </w:r>
+      <w:r>
+        <w:t>should be able to</w:t>
+      </w:r>
+      <w:r>
+        <w:t xml:space="preserve"> click near </w:t>
+      </w:r>
+      <w:r>
+        <w:t xml:space="preserve">an </w:t>
+      </w:r>
+      <w:r>
+        <w:t xml:space="preserve">intersection </w:t>
+      </w:r>
+      <w:r>
+        <w:t xml:space="preserve">that is on the </w:t>
+      </w:r>
+      <w:proofErr w:type="gramStart"/>
+      <w:r>
+        <w:t>board</w:t>
+      </w:r>
+      <w:proofErr w:type="gramEnd"/>
       <w:r>
         <w:t xml:space="preserve"> </w:t>
       </w:r>
       <w:r>
-        <w:t>Show your code and d</w:t>
-      </w:r>
-      <w:r>
-        <w:t xml:space="preserve">emonstrate to your instructor or lab assistant that you can click near an intersection and the stone will change as specified above. </w:t>
-      </w:r>
-      <w:r>
-        <w:t xml:space="preserve">Demonstrate that </w:t>
-      </w:r>
-      <w:r>
-        <w:t xml:space="preserve">clicking near the edge </w:t>
-      </w:r>
-      <w:r>
-        <w:t xml:space="preserve">does not </w:t>
-      </w:r>
-      <w:r>
-        <w:t xml:space="preserve">display a big black </w:t>
-      </w:r>
-      <w:r>
-        <w:rPr>
-          <w:rFonts w:ascii="CourierNewPS-BoldMT" w:hAnsi="CourierNewPS-BoldMT"/>
-          <w:b/>
-          <w:bCs/>
-          <w:sz w:val="34"/>
-          <w:szCs w:val="42"/>
-        </w:rPr>
-        <w:t>X</w:t>
-      </w:r>
-      <w:r>
-        <w:rPr>
-          <w:rFonts w:ascii="CourierNewPS-BoldMT" w:hAnsi="CourierNewPS-BoldMT"/>
-          <w:sz w:val="34"/>
-          <w:szCs w:val="42"/>
-        </w:rPr>
-        <w:t>.</w:t>
-      </w:r>
-    </w:p>
-    <w:p>
-      <w:pPr>
+        <w:t>and the stone will change as specified above.</w:t>
+      </w:r>
+    </w:p>
+    <w:p>
+      <w:pPr>
+        <w:pStyle w:val="ListParagraph"/>
         <w:widowControl w:val="0"/>
         <w:autoSpaceDE w:val="0"/>
         <w:autoSpaceDN w:val="0"/>
         <w:adjustRightInd w:val="0"/>
         <w:rPr>
-          <w:rFonts w:ascii="Times-Bold" w:hAnsi="Times-Bold"/>
-          <w:b/>
-          <w:sz w:val="29"/>
-          <w:szCs w:val="37"/>
-        </w:rPr>
-      </w:pPr>
+          <w:rFonts w:ascii="TimesNewRomanPSMT" w:hAnsi="TimesNewRomanPSMT"/>
+          <w:szCs w:val="32"/>
+        </w:rPr>
+      </w:pPr>
+    </w:p>
+    <w:p>
+      <w:pPr>
+        <w:widowControl w:val="0"/>
+        <w:autoSpaceDE w:val="0"/>
+        <w:autoSpaceDN w:val="0"/>
+        <w:adjustRightInd w:val="0"/>
+        <w:ind w:firstLine="360"/>
+        <w:rPr>
+          <w:rFonts w:ascii="TimesNewRomanPSMT" w:hAnsi="TimesNewRomanPSMT"/>
+          <w:szCs w:val="32"/>
+        </w:rPr>
+      </w:pPr>
+      <w:r>
+        <w:rPr>
+          <w:rFonts w:ascii="TimesNewRomanPSMT" w:hAnsi="TimesNewRomanPSMT"/>
+          <w:szCs w:val="32"/>
+        </w:rPr>
+        <w:t>-</w:t>
+      </w:r>
+      <w:r>
+        <w:rPr>
+          <w:rFonts w:ascii="TimesNewRomanPSMT" w:hAnsi="TimesNewRomanPSMT"/>
+          <w:szCs w:val="32"/>
+        </w:rPr>
+        <w:t xml:space="preserve"> </w:t>
+      </w:r>
+      <w:r>
+        <w:rPr>
+          <w:rFonts w:ascii="TimesNewRomanPSMT" w:hAnsi="TimesNewRomanPSMT"/>
+          <w:szCs w:val="32"/>
+        </w:rPr>
+        <w:t xml:space="preserve">and </w:t>
+      </w:r>
+      <w:r>
+        <w:rPr>
+          <w:rFonts w:ascii="TimesNewRomanPSMT" w:hAnsi="TimesNewRomanPSMT"/>
+          <w:szCs w:val="32"/>
+        </w:rPr>
+        <w:t>-</w:t>
+      </w:r>
+    </w:p>
+    <w:p>
+      <w:pPr>
+        <w:widowControl w:val="0"/>
+        <w:autoSpaceDE w:val="0"/>
+        <w:autoSpaceDN w:val="0"/>
+        <w:adjustRightInd w:val="0"/>
+        <w:ind w:firstLine="360"/>
+        <w:rPr>
+          <w:rFonts w:ascii="TimesNewRomanPSMT" w:hAnsi="TimesNewRomanPSMT"/>
+          <w:szCs w:val="32"/>
+        </w:rPr>
+      </w:pPr>
+    </w:p>
+    <w:p>
+      <w:pPr>
+        <w:pStyle w:val="ListParagraph"/>
+        <w:widowControl w:val="0"/>
+        <w:numPr>
+          <w:ilvl w:val="0"/>
+          <w:numId w:val="4"/>
+        </w:numPr>
+        <w:autoSpaceDE w:val="0"/>
+        <w:autoSpaceDN w:val="0"/>
+        <w:adjustRightInd w:val="0"/>
+        <w:rPr>
+          <w:rFonts w:ascii="TimesNewRomanPSMT" w:hAnsi="TimesNewRomanPSMT"/>
+          <w:szCs w:val="32"/>
+        </w:rPr>
+      </w:pPr>
+      <w:r>
+        <w:t>If you click near an intersection that is *off* the board, your code should do nothing (so the</w:t>
+      </w:r>
+      <w:r>
+        <w:t xml:space="preserve"> big black </w:t>
+      </w:r>
+      <w:r>
+        <w:rPr>
+          <w:rFonts w:ascii="CourierNewPS-BoldMT" w:hAnsi="CourierNewPS-BoldMT"/>
+          <w:b/>
+          <w:bCs/>
+          <w:sz w:val="34"/>
+          <w:szCs w:val="42"/>
+        </w:rPr>
+        <w:t>X</w:t>
+      </w:r>
+      <w:r>
+        <w:t xml:space="preserve"> does not appear). </w:t>
+      </w:r>
+      <w:r>
+        <w:rPr>
+          <w:rFonts w:ascii="TimesNewRomanPSMT" w:hAnsi="TimesNewRomanPSMT"/>
+          <w:szCs w:val="32"/>
+          <w:u w:val="single"/>
+        </w:rPr>
+        <w:t>Do not hardcode the dimensions of the board to make this work.</w:t>
+      </w:r>
+      <w:r>
+        <w:rPr>
+          <w:rFonts w:ascii="TimesNewRomanPSMT" w:hAnsi="TimesNewRomanPSMT"/>
+          <w:szCs w:val="32"/>
+        </w:rPr>
+        <w:t xml:space="preserve"> </w:t>
+      </w:r>
+    </w:p>
+    <w:p>
+      <w:pPr>
+        <w:widowControl w:val="0"/>
+        <w:autoSpaceDE w:val="0"/>
+        <w:autoSpaceDN w:val="0"/>
+        <w:adjustRightInd w:val="0"/>
+        <w:rPr>
+          <w:rFonts w:ascii="TimesNewRomanPSMT" w:hAnsi="TimesNewRomanPSMT"/>
+          <w:szCs w:val="32"/>
+        </w:rPr>
+      </w:pPr>
+    </w:p>
+    <w:p>
+      <w:pPr>
+        <w:rPr>
+          <w:b/>
+        </w:rPr>
+      </w:pPr>
+    </w:p>
+    <w:p>
+      <w:pPr>
+        <w:rPr>
+          <w:rFonts w:ascii="TimesNewRomanPSMT" w:hAnsi="TimesNewRomanPSMT"/>
+        </w:rPr>
+      </w:pPr>
+      <w:r>
+        <w:rPr>
+          <w:b/>
+        </w:rPr>
+        <w:t>C</w:t>
+      </w:r>
+      <w:r>
+        <w:rPr>
+          <w:b/>
+        </w:rPr>
+        <w:t xml:space="preserve">heckpoint </w:t>
+      </w:r>
+      <w:r>
+        <w:rPr>
+          <w:b/>
+        </w:rPr>
+        <w:t>10</w:t>
+      </w:r>
+      <w:r>
+        <w:rPr>
+          <w:b/>
+        </w:rPr>
+        <w:t xml:space="preserve"> (10 points):</w:t>
+      </w:r>
+      <w:r>
+        <w:t xml:space="preserve"> </w:t>
+      </w:r>
+      <w:r>
+        <w:t>Show your code and d</w:t>
+      </w:r>
+      <w:r>
+        <w:t>emonstrate to your instructor or lab assistant</w:t>
+      </w:r>
+      <w:r>
+        <w:t>.</w:t>
+      </w:r>
     </w:p>
     <w:p>
       <w:pPr>
@@ -3242,6 +3351,119 @@
     </w:lvl>
   </w:abstractNum>
   <w:abstractNum w:abstractNumId="1" w15:restartNumberingAfterBreak="0">
+    <w:nsid w:val="0C9C6638"/>
+    <w:multiLevelType w:val="hybridMultilevel"/>
+    <w:tmpl w:val="F24E2500"/>
+    <w:lvl w:ilvl="0" w:tplc="095091AC">
+      <w:start w:val="1"/>
+      <w:numFmt w:val="bullet"/>
+      <w:lvlText w:val="-"/>
+      <w:lvlJc w:val="left"/>
+      <w:pPr>
+        <w:ind w:left="720" w:hanging="360"/>
+      </w:pPr>
+      <w:rPr>
+        <w:rFonts w:ascii="TimesNewRomanPSMT" w:eastAsia="Times New Roman" w:hAnsi="TimesNewRomanPSMT" w:cs="TimesNewRomanPSMT" w:hint="default"/>
+      </w:rPr>
+    </w:lvl>
+    <w:lvl w:ilvl="1" w:tplc="04090003" w:tentative="1">
+      <w:start w:val="1"/>
+      <w:numFmt w:val="bullet"/>
+      <w:lvlText w:val="o"/>
+      <w:lvlJc w:val="left"/>
+      <w:pPr>
+        <w:ind w:left="1440" w:hanging="360"/>
+      </w:pPr>
+      <w:rPr>
+        <w:rFonts w:ascii="Courier New" w:hAnsi="Courier New" w:cs="Courier New" w:hint="default"/>
+      </w:rPr>
+    </w:lvl>
+    <w:lvl w:ilvl="2" w:tplc="04090005" w:tentative="1">
+      <w:start w:val="1"/>
+      <w:numFmt w:val="bullet"/>
+      <w:lvlText w:val=""/>
+      <w:lvlJc w:val="left"/>
+      <w:pPr>
+        <w:ind w:left="2160" w:hanging="360"/>
+      </w:pPr>
+      <w:rPr>
+        <w:rFonts w:ascii="Wingdings" w:hAnsi="Wingdings" w:hint="default"/>
+      </w:rPr>
+    </w:lvl>
+    <w:lvl w:ilvl="3" w:tplc="04090001" w:tentative="1">
+      <w:start w:val="1"/>
+      <w:numFmt w:val="bullet"/>
+      <w:lvlText w:val=""/>
+      <w:lvlJc w:val="left"/>
+      <w:pPr>
+        <w:ind w:left="2880" w:hanging="360"/>
+      </w:pPr>
+      <w:rPr>
+        <w:rFonts w:ascii="Symbol" w:hAnsi="Symbol" w:hint="default"/>
+      </w:rPr>
+    </w:lvl>
+    <w:lvl w:ilvl="4" w:tplc="04090003" w:tentative="1">
+      <w:start w:val="1"/>
+      <w:numFmt w:val="bullet"/>
+      <w:lvlText w:val="o"/>
+      <w:lvlJc w:val="left"/>
+      <w:pPr>
+        <w:ind w:left="3600" w:hanging="360"/>
+      </w:pPr>
+      <w:rPr>
+        <w:rFonts w:ascii="Courier New" w:hAnsi="Courier New" w:cs="Courier New" w:hint="default"/>
+      </w:rPr>
+    </w:lvl>
+    <w:lvl w:ilvl="5" w:tplc="04090005" w:tentative="1">
+      <w:start w:val="1"/>
+      <w:numFmt w:val="bullet"/>
+      <w:lvlText w:val=""/>
+      <w:lvlJc w:val="left"/>
+      <w:pPr>
+        <w:ind w:left="4320" w:hanging="360"/>
+      </w:pPr>
+      <w:rPr>
+        <w:rFonts w:ascii="Wingdings" w:hAnsi="Wingdings" w:hint="default"/>
+      </w:rPr>
+    </w:lvl>
+    <w:lvl w:ilvl="6" w:tplc="04090001" w:tentative="1">
+      <w:start w:val="1"/>
+      <w:numFmt w:val="bullet"/>
+      <w:lvlText w:val=""/>
+      <w:lvlJc w:val="left"/>
+      <w:pPr>
+        <w:ind w:left="5040" w:hanging="360"/>
+      </w:pPr>
+      <w:rPr>
+        <w:rFonts w:ascii="Symbol" w:hAnsi="Symbol" w:hint="default"/>
+      </w:rPr>
+    </w:lvl>
+    <w:lvl w:ilvl="7" w:tplc="04090003" w:tentative="1">
+      <w:start w:val="1"/>
+      <w:numFmt w:val="bullet"/>
+      <w:lvlText w:val="o"/>
+      <w:lvlJc w:val="left"/>
+      <w:pPr>
+        <w:ind w:left="5760" w:hanging="360"/>
+      </w:pPr>
+      <w:rPr>
+        <w:rFonts w:ascii="Courier New" w:hAnsi="Courier New" w:cs="Courier New" w:hint="default"/>
+      </w:rPr>
+    </w:lvl>
+    <w:lvl w:ilvl="8" w:tplc="04090005" w:tentative="1">
+      <w:start w:val="1"/>
+      <w:numFmt w:val="bullet"/>
+      <w:lvlText w:val=""/>
+      <w:lvlJc w:val="left"/>
+      <w:pPr>
+        <w:ind w:left="6480" w:hanging="360"/>
+      </w:pPr>
+      <w:rPr>
+        <w:rFonts w:ascii="Wingdings" w:hAnsi="Wingdings" w:hint="default"/>
+      </w:rPr>
+    </w:lvl>
+  </w:abstractNum>
+  <w:abstractNum w:abstractNumId="2" w15:restartNumberingAfterBreak="0">
     <w:nsid w:val="17380009"/>
     <w:multiLevelType w:val="hybridMultilevel"/>
     <w:tmpl w:val="09CC4AAA"/>
@@ -3382,7 +3604,7 @@
       </w:rPr>
     </w:lvl>
   </w:abstractNum>
-  <w:abstractNum w:abstractNumId="2" w15:restartNumberingAfterBreak="0">
+  <w:abstractNum w:abstractNumId="3" w15:restartNumberingAfterBreak="0">
     <w:nsid w:val="19E81DD1"/>
     <w:multiLevelType w:val="hybridMultilevel"/>
     <w:tmpl w:val="FF7AA602"/>
@@ -3489,6 +3711,321 @@
       <w:lvlJc w:val="left"/>
       <w:pPr>
         <w:ind w:left="6480" w:hanging="360"/>
+      </w:pPr>
+      <w:rPr>
+        <w:rFonts w:ascii="Wingdings" w:hAnsi="Wingdings" w:hint="default"/>
+      </w:rPr>
+    </w:lvl>
+  </w:abstractNum>
+  <w:abstractNum w:abstractNumId="4" w15:restartNumberingAfterBreak="0">
+    <w:nsid w:val="217F4390"/>
+    <w:multiLevelType w:val="hybridMultilevel"/>
+    <w:tmpl w:val="942A94B4"/>
+    <w:lvl w:ilvl="0" w:tplc="D7D8FB18">
+      <w:start w:val="1"/>
+      <w:numFmt w:val="bullet"/>
+      <w:lvlText w:val="-"/>
+      <w:lvlJc w:val="left"/>
+      <w:pPr>
+        <w:ind w:left="720" w:hanging="360"/>
+      </w:pPr>
+      <w:rPr>
+        <w:rFonts w:ascii="TimesNewRomanPSMT" w:eastAsia="Times New Roman" w:hAnsi="TimesNewRomanPSMT" w:cs="TimesNewRomanPSMT" w:hint="default"/>
+      </w:rPr>
+    </w:lvl>
+    <w:lvl w:ilvl="1" w:tplc="04090003" w:tentative="1">
+      <w:start w:val="1"/>
+      <w:numFmt w:val="bullet"/>
+      <w:lvlText w:val="o"/>
+      <w:lvlJc w:val="left"/>
+      <w:pPr>
+        <w:ind w:left="1440" w:hanging="360"/>
+      </w:pPr>
+      <w:rPr>
+        <w:rFonts w:ascii="Courier New" w:hAnsi="Courier New" w:cs="Courier New" w:hint="default"/>
+      </w:rPr>
+    </w:lvl>
+    <w:lvl w:ilvl="2" w:tplc="04090005" w:tentative="1">
+      <w:start w:val="1"/>
+      <w:numFmt w:val="bullet"/>
+      <w:lvlText w:val=""/>
+      <w:lvlJc w:val="left"/>
+      <w:pPr>
+        <w:ind w:left="2160" w:hanging="360"/>
+      </w:pPr>
+      <w:rPr>
+        <w:rFonts w:ascii="Wingdings" w:hAnsi="Wingdings" w:hint="default"/>
+      </w:rPr>
+    </w:lvl>
+    <w:lvl w:ilvl="3" w:tplc="04090001" w:tentative="1">
+      <w:start w:val="1"/>
+      <w:numFmt w:val="bullet"/>
+      <w:lvlText w:val=""/>
+      <w:lvlJc w:val="left"/>
+      <w:pPr>
+        <w:ind w:left="2880" w:hanging="360"/>
+      </w:pPr>
+      <w:rPr>
+        <w:rFonts w:ascii="Symbol" w:hAnsi="Symbol" w:hint="default"/>
+      </w:rPr>
+    </w:lvl>
+    <w:lvl w:ilvl="4" w:tplc="04090003" w:tentative="1">
+      <w:start w:val="1"/>
+      <w:numFmt w:val="bullet"/>
+      <w:lvlText w:val="o"/>
+      <w:lvlJc w:val="left"/>
+      <w:pPr>
+        <w:ind w:left="3600" w:hanging="360"/>
+      </w:pPr>
+      <w:rPr>
+        <w:rFonts w:ascii="Courier New" w:hAnsi="Courier New" w:cs="Courier New" w:hint="default"/>
+      </w:rPr>
+    </w:lvl>
+    <w:lvl w:ilvl="5" w:tplc="04090005" w:tentative="1">
+      <w:start w:val="1"/>
+      <w:numFmt w:val="bullet"/>
+      <w:lvlText w:val=""/>
+      <w:lvlJc w:val="left"/>
+      <w:pPr>
+        <w:ind w:left="4320" w:hanging="360"/>
+      </w:pPr>
+      <w:rPr>
+        <w:rFonts w:ascii="Wingdings" w:hAnsi="Wingdings" w:hint="default"/>
+      </w:rPr>
+    </w:lvl>
+    <w:lvl w:ilvl="6" w:tplc="04090001" w:tentative="1">
+      <w:start w:val="1"/>
+      <w:numFmt w:val="bullet"/>
+      <w:lvlText w:val=""/>
+      <w:lvlJc w:val="left"/>
+      <w:pPr>
+        <w:ind w:left="5040" w:hanging="360"/>
+      </w:pPr>
+      <w:rPr>
+        <w:rFonts w:ascii="Symbol" w:hAnsi="Symbol" w:hint="default"/>
+      </w:rPr>
+    </w:lvl>
+    <w:lvl w:ilvl="7" w:tplc="04090003" w:tentative="1">
+      <w:start w:val="1"/>
+      <w:numFmt w:val="bullet"/>
+      <w:lvlText w:val="o"/>
+      <w:lvlJc w:val="left"/>
+      <w:pPr>
+        <w:ind w:left="5760" w:hanging="360"/>
+      </w:pPr>
+      <w:rPr>
+        <w:rFonts w:ascii="Courier New" w:hAnsi="Courier New" w:cs="Courier New" w:hint="default"/>
+      </w:rPr>
+    </w:lvl>
+    <w:lvl w:ilvl="8" w:tplc="04090005" w:tentative="1">
+      <w:start w:val="1"/>
+      <w:numFmt w:val="bullet"/>
+      <w:lvlText w:val=""/>
+      <w:lvlJc w:val="left"/>
+      <w:pPr>
+        <w:ind w:left="6480" w:hanging="360"/>
+      </w:pPr>
+      <w:rPr>
+        <w:rFonts w:ascii="Wingdings" w:hAnsi="Wingdings" w:hint="default"/>
+      </w:rPr>
+    </w:lvl>
+  </w:abstractNum>
+  <w:abstractNum w:abstractNumId="5" w15:restartNumberingAfterBreak="0">
+    <w:nsid w:val="41B9164F"/>
+    <w:multiLevelType w:val="hybridMultilevel"/>
+    <w:tmpl w:val="1BFAA4F2"/>
+    <w:lvl w:ilvl="0" w:tplc="0409000F">
+      <w:start w:val="1"/>
+      <w:numFmt w:val="decimal"/>
+      <w:lvlText w:val="%1."/>
+      <w:lvlJc w:val="left"/>
+      <w:pPr>
+        <w:ind w:left="720" w:hanging="360"/>
+      </w:pPr>
+      <w:rPr>
+        <w:rFonts w:ascii="Times New Roman" w:hAnsi="Times New Roman" w:hint="default"/>
+      </w:rPr>
+    </w:lvl>
+    <w:lvl w:ilvl="1" w:tplc="04090019" w:tentative="1">
+      <w:start w:val="1"/>
+      <w:numFmt w:val="lowerLetter"/>
+      <w:lvlText w:val="%2."/>
+      <w:lvlJc w:val="left"/>
+      <w:pPr>
+        <w:ind w:left="1440" w:hanging="360"/>
+      </w:pPr>
+    </w:lvl>
+    <w:lvl w:ilvl="2" w:tplc="0409001B" w:tentative="1">
+      <w:start w:val="1"/>
+      <w:numFmt w:val="lowerRoman"/>
+      <w:lvlText w:val="%3."/>
+      <w:lvlJc w:val="right"/>
+      <w:pPr>
+        <w:ind w:left="2160" w:hanging="180"/>
+      </w:pPr>
+    </w:lvl>
+    <w:lvl w:ilvl="3" w:tplc="0409000F" w:tentative="1">
+      <w:start w:val="1"/>
+      <w:numFmt w:val="decimal"/>
+      <w:lvlText w:val="%4."/>
+      <w:lvlJc w:val="left"/>
+      <w:pPr>
+        <w:ind w:left="2880" w:hanging="360"/>
+      </w:pPr>
+    </w:lvl>
+    <w:lvl w:ilvl="4" w:tplc="04090019" w:tentative="1">
+      <w:start w:val="1"/>
+      <w:numFmt w:val="lowerLetter"/>
+      <w:lvlText w:val="%5."/>
+      <w:lvlJc w:val="left"/>
+      <w:pPr>
+        <w:ind w:left="3600" w:hanging="360"/>
+      </w:pPr>
+    </w:lvl>
+    <w:lvl w:ilvl="5" w:tplc="0409001B" w:tentative="1">
+      <w:start w:val="1"/>
+      <w:numFmt w:val="lowerRoman"/>
+      <w:lvlText w:val="%6."/>
+      <w:lvlJc w:val="right"/>
+      <w:pPr>
+        <w:ind w:left="4320" w:hanging="180"/>
+      </w:pPr>
+    </w:lvl>
+    <w:lvl w:ilvl="6" w:tplc="0409000F" w:tentative="1">
+      <w:start w:val="1"/>
+      <w:numFmt w:val="decimal"/>
+      <w:lvlText w:val="%7."/>
+      <w:lvlJc w:val="left"/>
+      <w:pPr>
+        <w:ind w:left="5040" w:hanging="360"/>
+      </w:pPr>
+    </w:lvl>
+    <w:lvl w:ilvl="7" w:tplc="04090019" w:tentative="1">
+      <w:start w:val="1"/>
+      <w:numFmt w:val="lowerLetter"/>
+      <w:lvlText w:val="%8."/>
+      <w:lvlJc w:val="left"/>
+      <w:pPr>
+        <w:ind w:left="5760" w:hanging="360"/>
+      </w:pPr>
+    </w:lvl>
+    <w:lvl w:ilvl="8" w:tplc="0409001B" w:tentative="1">
+      <w:start w:val="1"/>
+      <w:numFmt w:val="lowerRoman"/>
+      <w:lvlText w:val="%9."/>
+      <w:lvlJc w:val="right"/>
+      <w:pPr>
+        <w:ind w:left="6480" w:hanging="180"/>
+      </w:pPr>
+    </w:lvl>
+  </w:abstractNum>
+  <w:abstractNum w:abstractNumId="6" w15:restartNumberingAfterBreak="0">
+    <w:nsid w:val="7F023209"/>
+    <w:multiLevelType w:val="hybridMultilevel"/>
+    <w:tmpl w:val="0F720DA2"/>
+    <w:lvl w:ilvl="0" w:tplc="94B433B4">
+      <w:start w:val="1"/>
+      <w:numFmt w:val="bullet"/>
+      <w:lvlText w:val="-"/>
+      <w:lvlJc w:val="left"/>
+      <w:pPr>
+        <w:ind w:left="1080" w:hanging="360"/>
+      </w:pPr>
+      <w:rPr>
+        <w:rFonts w:ascii="TimesNewRomanPSMT" w:eastAsia="Times New Roman" w:hAnsi="TimesNewRomanPSMT" w:cs="TimesNewRomanPSMT" w:hint="default"/>
+      </w:rPr>
+    </w:lvl>
+    <w:lvl w:ilvl="1" w:tplc="04090003" w:tentative="1">
+      <w:start w:val="1"/>
+      <w:numFmt w:val="bullet"/>
+      <w:lvlText w:val="o"/>
+      <w:lvlJc w:val="left"/>
+      <w:pPr>
+        <w:ind w:left="1800" w:hanging="360"/>
+      </w:pPr>
+      <w:rPr>
+        <w:rFonts w:ascii="Courier New" w:hAnsi="Courier New" w:cs="Courier New" w:hint="default"/>
+      </w:rPr>
+    </w:lvl>
+    <w:lvl w:ilvl="2" w:tplc="04090005" w:tentative="1">
+      <w:start w:val="1"/>
+      <w:numFmt w:val="bullet"/>
+      <w:lvlText w:val=""/>
+      <w:lvlJc w:val="left"/>
+      <w:pPr>
+        <w:ind w:left="2520" w:hanging="360"/>
+      </w:pPr>
+      <w:rPr>
+        <w:rFonts w:ascii="Wingdings" w:hAnsi="Wingdings" w:hint="default"/>
+      </w:rPr>
+    </w:lvl>
+    <w:lvl w:ilvl="3" w:tplc="04090001" w:tentative="1">
+      <w:start w:val="1"/>
+      <w:numFmt w:val="bullet"/>
+      <w:lvlText w:val=""/>
+      <w:lvlJc w:val="left"/>
+      <w:pPr>
+        <w:ind w:left="3240" w:hanging="360"/>
+      </w:pPr>
+      <w:rPr>
+        <w:rFonts w:ascii="Symbol" w:hAnsi="Symbol" w:hint="default"/>
+      </w:rPr>
+    </w:lvl>
+    <w:lvl w:ilvl="4" w:tplc="04090003" w:tentative="1">
+      <w:start w:val="1"/>
+      <w:numFmt w:val="bullet"/>
+      <w:lvlText w:val="o"/>
+      <w:lvlJc w:val="left"/>
+      <w:pPr>
+        <w:ind w:left="3960" w:hanging="360"/>
+      </w:pPr>
+      <w:rPr>
+        <w:rFonts w:ascii="Courier New" w:hAnsi="Courier New" w:cs="Courier New" w:hint="default"/>
+      </w:rPr>
+    </w:lvl>
+    <w:lvl w:ilvl="5" w:tplc="04090005" w:tentative="1">
+      <w:start w:val="1"/>
+      <w:numFmt w:val="bullet"/>
+      <w:lvlText w:val=""/>
+      <w:lvlJc w:val="left"/>
+      <w:pPr>
+        <w:ind w:left="4680" w:hanging="360"/>
+      </w:pPr>
+      <w:rPr>
+        <w:rFonts w:ascii="Wingdings" w:hAnsi="Wingdings" w:hint="default"/>
+      </w:rPr>
+    </w:lvl>
+    <w:lvl w:ilvl="6" w:tplc="04090001" w:tentative="1">
+      <w:start w:val="1"/>
+      <w:numFmt w:val="bullet"/>
+      <w:lvlText w:val=""/>
+      <w:lvlJc w:val="left"/>
+      <w:pPr>
+        <w:ind w:left="5400" w:hanging="360"/>
+      </w:pPr>
+      <w:rPr>
+        <w:rFonts w:ascii="Symbol" w:hAnsi="Symbol" w:hint="default"/>
+      </w:rPr>
+    </w:lvl>
+    <w:lvl w:ilvl="7" w:tplc="04090003" w:tentative="1">
+      <w:start w:val="1"/>
+      <w:numFmt w:val="bullet"/>
+      <w:lvlText w:val="o"/>
+      <w:lvlJc w:val="left"/>
+      <w:pPr>
+        <w:ind w:left="6120" w:hanging="360"/>
+      </w:pPr>
+      <w:rPr>
+        <w:rFonts w:ascii="Courier New" w:hAnsi="Courier New" w:cs="Courier New" w:hint="default"/>
+      </w:rPr>
+    </w:lvl>
+    <w:lvl w:ilvl="8" w:tplc="04090005" w:tentative="1">
+      <w:start w:val="1"/>
+      <w:numFmt w:val="bullet"/>
+      <w:lvlText w:val=""/>
+      <w:lvlJc w:val="left"/>
+      <w:pPr>
+        <w:ind w:left="6840" w:hanging="360"/>
       </w:pPr>
       <w:rPr>
         <w:rFonts w:ascii="Wingdings" w:hAnsi="Wingdings" w:hint="default"/>
@@ -3499,10 +4036,22 @@
     <w:abstractNumId w:val="0"/>
   </w:num>
   <w:num w:numId="2" w16cid:durableId="884827273">
+    <w:abstractNumId w:val="2"/>
+  </w:num>
+  <w:num w:numId="3" w16cid:durableId="260844799">
+    <w:abstractNumId w:val="3"/>
+  </w:num>
+  <w:num w:numId="4" w16cid:durableId="1668435109">
+    <w:abstractNumId w:val="5"/>
+  </w:num>
+  <w:num w:numId="5" w16cid:durableId="1258562258">
     <w:abstractNumId w:val="1"/>
   </w:num>
-  <w:num w:numId="3" w16cid:durableId="260844799">
-    <w:abstractNumId w:val="2"/>
+  <w:num w:numId="6" w16cid:durableId="1061438907">
+    <w:abstractNumId w:val="6"/>
+  </w:num>
+  <w:num w:numId="7" w16cid:durableId="1083187224">
+    <w:abstractNumId w:val="4"/>
   </w:num>
 </w:numbering>
 </file>
@@ -4024,6 +4573,15 @@
     <w:uiPriority w:val="99"/>
     <w:rsid w:val="0002611D"/>
   </w:style>
+  <w:style w:type="paragraph" w:styleId="ListParagraph">
+    <w:name w:val="List Paragraph"/>
+    <w:basedOn w:val="Normal"/>
+    <w:rsid w:val="00891434"/>
+    <w:pPr>
+      <w:ind w:left="720"/>
+      <w:contextualSpacing/>
+    </w:pPr>
+  </w:style>
 </w:styles>
 </file>
 

</xml_diff>

<commit_message>
Added rationale for Steve Vegdahl's previous commit that makes the array sometimes contain all negative or all positive numbers.
</commit_message>
<xml_diff>
--- a/Lab 6 - Arrays I.docx
+++ b/Lab 6 - Arrays I.docx
@@ -673,19 +673,7 @@
         <w:rPr>
           <w:rFonts w:ascii="TimesNewRomanPSMT" w:hAnsi="TimesNewRomanPSMT"/>
         </w:rPr>
-        <w:t xml:space="preserve">After you have set the breakpoint, run the program. When the breakpoint is hit, the debugger window should open. </w:t>
-      </w:r>
-      <w:r>
-        <w:rPr>
-          <w:rFonts w:ascii="TimesNewRomanPSMT" w:hAnsi="TimesNewRomanPSMT"/>
-        </w:rPr>
-        <w:t xml:space="preserve">Press “Step” until the line that creates the array has run. </w:t>
-      </w:r>
-      <w:r>
-        <w:rPr>
-          <w:rFonts w:ascii="TimesNewRomanPSMT" w:hAnsi="TimesNewRomanPSMT"/>
-        </w:rPr>
-        <w:t>Double-click on the array’s name in the debugger window. A window will pop up that displays the array’s contents.</w:t>
+        <w:t>After you have set the breakpoint, run the program. When the breakpoint is hit, the debugger window should open. Press “Step” until the line that creates the array has run. Double-click on the array’s name in the debugger window. A window will pop up that displays the array’s contents.</w:t>
       </w:r>
     </w:p>
     <w:p>
@@ -875,19 +863,7 @@
         <w:rPr>
           <w:rFonts w:ascii="TimesNewRomanPSMT" w:hAnsi="TimesNewRomanPSMT"/>
         </w:rPr>
-        <w:t>HINT: keep track of the sum-so-far of the array as you loop through it</w:t>
-      </w:r>
-      <w:r>
-        <w:rPr>
-          <w:rFonts w:ascii="TimesNewRomanPSMT" w:hAnsi="TimesNewRomanPSMT"/>
-        </w:rPr>
-        <w:t>, then compute the average at the end</w:t>
-      </w:r>
-      <w:r>
-        <w:rPr>
-          <w:rFonts w:ascii="TimesNewRomanPSMT" w:hAnsi="TimesNewRomanPSMT"/>
-        </w:rPr>
-        <w:t xml:space="preserve">. </w:t>
+        <w:t xml:space="preserve">HINT: keep track of the sum-so-far of the array as you loop through it, then compute the average at the end. </w:t>
       </w:r>
       <w:r>
         <w:rPr>
@@ -1050,6 +1026,34 @@
           <w:szCs w:val="32"/>
         </w:rPr>
         <w:t xml:space="preserve">HINT: what could you keep track of this time instead of the sum-so-far? </w:t>
+      </w:r>
+      <w:r>
+        <w:rPr>
+          <w:rFonts w:ascii="TimesNewRomanPSMT" w:hAnsi="TimesNewRomanPSMT"/>
+          <w:szCs w:val="32"/>
+        </w:rPr>
+        <w:t xml:space="preserve">Make sure to test </w:t>
+      </w:r>
+      <w:r>
+        <w:rPr>
+          <w:rFonts w:ascii="TimesNewRomanPSMT" w:hAnsi="TimesNewRomanPSMT"/>
+          <w:szCs w:val="32"/>
+        </w:rPr>
+        <w:t>your code</w:t>
+      </w:r>
+      <w:r>
+        <w:rPr>
+          <w:rFonts w:ascii="TimesNewRomanPSMT" w:hAnsi="TimesNewRomanPSMT"/>
+          <w:szCs w:val="32"/>
+        </w:rPr>
+        <w:t xml:space="preserve"> on array sizes of 5 and 31.</w:t>
+      </w:r>
+      <w:r>
+        <w:rPr>
+          <w:rFonts w:ascii="TimesNewRomanPSMT" w:hAnsi="TimesNewRomanPSMT"/>
+          <w:szCs w:val="32"/>
+        </w:rPr>
+        <w:t xml:space="preserve"> </w:t>
       </w:r>
       <w:r>
         <w:rPr>
@@ -1924,7 +1928,15 @@
           <w:rFonts w:ascii="TimesNewRomanPSMT" w:hAnsi="TimesNewRomanPSMT"/>
           <w:szCs w:val="32"/>
         </w:rPr>
-        <w:t xml:space="preserve">At the present time, the project causes a frame to be displayed that contains four buttons and a </w:t>
+        <w:t xml:space="preserve">At the present time, the project causes a frame to be displayed that contains four </w:t>
+      </w:r>
+      <w:r>
+        <w:rPr>
+          <w:rFonts w:ascii="TimesNewRomanPSMT" w:hAnsi="TimesNewRomanPSMT"/>
+          <w:szCs w:val="32"/>
+        </w:rPr>
+        <w:lastRenderedPageBreak/>
+        <w:t xml:space="preserve">buttons and a </w:t>
       </w:r>
       <w:r>
         <w:rPr>
@@ -1952,15 +1964,7 @@
           <w:rFonts w:ascii="TimesNewRomanPSMT" w:hAnsi="TimesNewRomanPSMT"/>
           <w:szCs w:val="32"/>
         </w:rPr>
-        <w:t xml:space="preserve">. The only button that is </w:t>
-      </w:r>
-      <w:r>
-        <w:rPr>
-          <w:rFonts w:ascii="TimesNewRomanPSMT" w:hAnsi="TimesNewRomanPSMT"/>
-          <w:szCs w:val="32"/>
-        </w:rPr>
-        <w:lastRenderedPageBreak/>
-        <w:t>implemented is the "Spiral" button. Pressing this will cause two spirals made out of Go pieces to be drawn on the board. No other functionality is currently implemented.</w:t>
+        <w:t>. The only button that is implemented is the "Spiral" button. Pressing this will cause two spirals made out of Go pieces to be drawn on the board. No other functionality is currently implemented.</w:t>
       </w:r>
     </w:p>
     <w:p>
@@ -2714,6 +2718,7 @@
           <w:rFonts w:ascii="TimesNewRomanPSMT" w:hAnsi="TimesNewRomanPSMT"/>
           <w:szCs w:val="32"/>
         </w:rPr>
+        <w:lastRenderedPageBreak/>
         <w:t xml:space="preserve">Your task is to modify </w:t>
       </w:r>
       <w:proofErr w:type="spellStart"/>
@@ -2742,15 +2747,7 @@
           <w:rFonts w:ascii="TimesNewRomanPSMT" w:hAnsi="TimesNewRomanPSMT"/>
           <w:szCs w:val="32"/>
         </w:rPr>
-        <w:t xml:space="preserve"> whenever the mouse is </w:t>
-      </w:r>
-      <w:r>
-        <w:rPr>
-          <w:rFonts w:ascii="TimesNewRomanPSMT" w:hAnsi="TimesNewRomanPSMT"/>
-          <w:szCs w:val="32"/>
-        </w:rPr>
-        <w:lastRenderedPageBreak/>
-        <w:t>pressed at a legal intersection:</w:t>
+        <w:t xml:space="preserve"> whenever the mouse is pressed at a legal intersection:</w:t>
       </w:r>
     </w:p>
     <w:p>
@@ -3082,10 +3079,7 @@
         </w:rPr>
       </w:pPr>
       <w:r>
-        <w:t>If you click near an intersection that is *off* the board, your code should do nothing (so the</w:t>
-      </w:r>
-      <w:r>
-        <w:t xml:space="preserve"> big black </w:t>
+        <w:t xml:space="preserve">If you click near an intersection that is *off* the board, your code should do nothing (so the big black </w:t>
       </w:r>
       <w:r>
         <w:rPr>

</xml_diff>